<commit_message>
Completa panel y visor de croquis con fotos privadas y evidencias
Agrega consulta de solo lectura, mejoras de agenda y clientes, 30 pruebas de aislamiento y documentación de Fase 2. Regresión verificada: 107 backend y 98 frontend aprobadas.
</commit_message>
<xml_diff>
--- a/Fase 2/Documentos/01_Documento_Inicio_Fase2.docx
+++ b/Fase 2/Documentos/01_Documento_Inicio_Fase2.docx
@@ -7,6 +7,9 @@
         <w:pStyle w:val="Title"/>
       </w:pPr>
       <w:r>
+        <w:rPr>
+          <w:color w:val="000000"/>
+        </w:rPr>
         <w:t>Documento de inicio de Fase 2</w:t>
       </w:r>
     </w:p>
@@ -20,7 +23,7 @@
           <w:color w:val="315B78"/>
           <w:sz w:val="22"/>
         </w:rPr>
-        <w:t>Alcance, MVP, restricciones y criterios de éxito</w:t>
+        <w:t>Alcance del MVP y estado técnico al 20 de octubre de 2026</w:t>
       </w:r>
     </w:p>
     <w:tbl>
@@ -28,12 +31,23 @@
         <w:tblStyle w:val="TableGrid"/>
         <w:tblW w:type="auto" w:w="0"/>
         <w:tblLook w:firstColumn="1" w:firstRow="1" w:lastColumn="0" w:lastRow="0" w:noHBand="0" w:noVBand="1" w:val="04A0"/>
+        <w:tblBorders>
+          <w:top w:val="single" w:sz="4" w:color="D9D9D9"/>
+          <w:left w:val="single" w:sz="4" w:color="D9D9D9"/>
+          <w:bottom w:val="single" w:sz="4" w:color="D9D9D9"/>
+          <w:right w:val="single" w:sz="4" w:color="D9D9D9"/>
+          <w:insideH w:val="single" w:sz="4" w:color="D9D9D9"/>
+          <w:insideV w:val="single" w:sz="4" w:color="D9D9D9"/>
+        </w:tblBorders>
       </w:tblPr>
       <w:tblGrid>
         <w:gridCol w:w="5040"/>
         <w:gridCol w:w="5040"/>
       </w:tblGrid>
       <w:tr>
+        <w:trPr>
+          <w:tblHeader/>
+        </w:trPr>
         <w:tc>
           <w:tcPr>
             <w:tcW w:type="dxa" w:w="4896"/>
@@ -49,6 +63,8 @@
           </w:tcPr>
           <w:p>
             <w:pPr>
+              <w:keepNext w:val="0"/>
+              <w:keepLines w:val="0"/>
               <w:spacing w:after="40" w:before="40"/>
             </w:pPr>
             <w:r/>
@@ -77,6 +93,8 @@
           </w:tcPr>
           <w:p>
             <w:pPr>
+              <w:keepNext w:val="0"/>
+              <w:keepLines w:val="0"/>
               <w:spacing w:after="40" w:before="40"/>
             </w:pPr>
             <w:r/>
@@ -91,6 +109,7 @@
         </w:tc>
       </w:tr>
       <w:tr>
+        <w:trPr/>
         <w:tc>
           <w:tcPr>
             <w:tcW w:type="dxa" w:w="4896"/>
@@ -106,16 +125,12 @@
           </w:tcPr>
           <w:p>
             <w:pPr>
+              <w:keepNext w:val="0"/>
+              <w:keepLines w:val="0"/>
               <w:spacing w:after="40" w:before="40"/>
             </w:pPr>
-            <w:r/>
             <w:r>
-              <w:rPr>
-                <w:b/>
-                <w:color w:val="16382F"/>
-                <w:sz w:val="18"/>
-              </w:rPr>
-              <w:t>Fecha</w:t>
+              <w:t>Actualización documental</w:t>
             </w:r>
           </w:p>
         </w:tc>
@@ -134,15 +149,12 @@
           </w:tcPr>
           <w:p>
             <w:pPr>
+              <w:keepNext w:val="0"/>
+              <w:keepLines w:val="0"/>
               <w:spacing w:after="40" w:before="40"/>
             </w:pPr>
-            <w:r/>
             <w:r>
-              <w:rPr>
-                <w:b w:val="0"/>
-                <w:sz w:val="18"/>
-              </w:rPr>
-              <w:t>4 de octubre de 2026</w:t>
+              <w:t>20 de octubre de 2026</w:t>
             </w:r>
           </w:p>
         </w:tc>
@@ -162,6 +174,9 @@
         <w:pStyle w:val="Heading1"/>
       </w:pPr>
       <w:r>
+        <w:rPr>
+          <w:color w:val="000000"/>
+        </w:rPr>
         <w:t>1 Propósito y contexto</w:t>
       </w:r>
     </w:p>
@@ -178,6 +193,9 @@
         <w:pStyle w:val="Heading1"/>
       </w:pPr>
       <w:r>
+        <w:rPr>
+          <w:color w:val="000000"/>
+        </w:rPr>
         <w:t>2 Alcance del MVP</w:t>
       </w:r>
     </w:p>
@@ -186,12 +204,23 @@
         <w:tblStyle w:val="TableGrid"/>
         <w:tblW w:type="auto" w:w="0"/>
         <w:tblLook w:firstColumn="1" w:firstRow="1" w:lastColumn="0" w:lastRow="0" w:noHBand="0" w:noVBand="1" w:val="04A0"/>
+        <w:tblBorders>
+          <w:top w:val="single" w:sz="4" w:color="D9D9D9"/>
+          <w:left w:val="single" w:sz="4" w:color="D9D9D9"/>
+          <w:bottom w:val="single" w:sz="4" w:color="D9D9D9"/>
+          <w:right w:val="single" w:sz="4" w:color="D9D9D9"/>
+          <w:insideH w:val="single" w:sz="4" w:color="D9D9D9"/>
+          <w:insideV w:val="single" w:sz="4" w:color="D9D9D9"/>
+        </w:tblBorders>
       </w:tblPr>
       <w:tblGrid>
         <w:gridCol w:w="5040"/>
         <w:gridCol w:w="5040"/>
       </w:tblGrid>
       <w:tr>
+        <w:trPr>
+          <w:tblHeader/>
+        </w:trPr>
         <w:tc>
           <w:tcPr>
             <w:tcW w:type="dxa" w:w="2448"/>
@@ -208,15 +237,11 @@
           </w:tcPr>
           <w:p>
             <w:pPr>
+              <w:keepNext w:val="0"/>
+              <w:keepLines w:val="0"/>
               <w:spacing w:after="40" w:before="40"/>
             </w:pPr>
-            <w:r/>
             <w:r>
-              <w:rPr>
-                <w:b/>
-                <w:color w:val="FFFFFF"/>
-                <w:sz w:val="17"/>
-              </w:rPr>
               <w:t>Incluye</w:t>
             </w:r>
           </w:p>
@@ -237,21 +262,18 @@
           </w:tcPr>
           <w:p>
             <w:pPr>
+              <w:keepNext w:val="0"/>
+              <w:keepLines w:val="0"/>
               <w:spacing w:after="40" w:before="40"/>
             </w:pPr>
-            <w:r/>
             <w:r>
-              <w:rPr>
-                <w:b/>
-                <w:color w:val="FFFFFF"/>
-                <w:sz w:val="17"/>
-              </w:rPr>
-              <w:t>Resultado esperado</w:t>
+              <w:t>Resultado y estado comprobable</w:t>
             </w:r>
           </w:p>
         </w:tc>
       </w:tr>
       <w:tr>
+        <w:trPr/>
         <w:tc>
           <w:tcPr>
             <w:tcW w:type="dxa" w:w="2448"/>
@@ -267,14 +289,11 @@
           </w:tcPr>
           <w:p>
             <w:pPr>
+              <w:keepNext w:val="0"/>
+              <w:keepLines w:val="0"/>
               <w:spacing w:after="40" w:before="40"/>
             </w:pPr>
-            <w:r/>
             <w:r>
-              <w:rPr>
-                <w:b w:val="0"/>
-                <w:sz w:val="17"/>
-              </w:rPr>
               <w:t>Autenticación</w:t>
             </w:r>
           </w:p>
@@ -294,20 +313,18 @@
           </w:tcPr>
           <w:p>
             <w:pPr>
+              <w:keepNext w:val="0"/>
+              <w:keepLines w:val="0"/>
               <w:spacing w:after="40" w:before="40"/>
             </w:pPr>
-            <w:r/>
             <w:r>
-              <w:rPr>
-                <w:b w:val="0"/>
-                <w:sz w:val="17"/>
-              </w:rPr>
-              <w:t>Usuarios administrativos y operadores con permisos diferenciados.</w:t>
+              <w:t>JWT y roles administrativos/operador implementados; login y restricciones verificados en el reporte de 32 casos.</w:t>
             </w:r>
           </w:p>
         </w:tc>
       </w:tr>
       <w:tr>
+        <w:trPr/>
         <w:tc>
           <w:tcPr>
             <w:tcW w:type="dxa" w:w="2448"/>
@@ -324,14 +341,11 @@
           </w:tcPr>
           <w:p>
             <w:pPr>
+              <w:keepNext w:val="0"/>
+              <w:keepLines w:val="0"/>
               <w:spacing w:after="40" w:before="40"/>
             </w:pPr>
-            <w:r/>
             <w:r>
-              <w:rPr>
-                <w:b w:val="0"/>
-                <w:sz w:val="17"/>
-              </w:rPr>
               <w:t>Panel web</w:t>
             </w:r>
           </w:p>
@@ -352,20 +366,18 @@
           </w:tcPr>
           <w:p>
             <w:pPr>
+              <w:keepNext w:val="0"/>
+              <w:keepLines w:val="0"/>
               <w:spacing w:after="40" w:before="40"/>
             </w:pPr>
-            <w:r/>
             <w:r>
-              <w:rPr>
-                <w:b w:val="0"/>
-                <w:sz w:val="17"/>
-              </w:rPr>
-              <w:t>Agenda por fecha y operador, estadísticas y gestión de clientes.</w:t>
+              <w:t>Agenda por fecha chilena y operador, edición y reprogramación, clientes y visor de croquis con fotos privadas. Regresión actual: 98 pruebas frontend y 107 backend; evidencia E4.</w:t>
             </w:r>
           </w:p>
         </w:tc>
       </w:tr>
       <w:tr>
+        <w:trPr/>
         <w:tc>
           <w:tcPr>
             <w:tcW w:type="dxa" w:w="2448"/>
@@ -381,14 +393,11 @@
           </w:tcPr>
           <w:p>
             <w:pPr>
+              <w:keepNext w:val="0"/>
+              <w:keepLines w:val="0"/>
               <w:spacing w:after="40" w:before="40"/>
             </w:pPr>
-            <w:r/>
             <w:r>
-              <w:rPr>
-                <w:b w:val="0"/>
-                <w:sz w:val="17"/>
-              </w:rPr>
               <w:t>Agendamiento</w:t>
             </w:r>
           </w:p>
@@ -408,20 +417,18 @@
           </w:tcPr>
           <w:p>
             <w:pPr>
+              <w:keepNext w:val="0"/>
+              <w:keepLines w:val="0"/>
               <w:spacing w:after="40" w:before="40"/>
             </w:pPr>
-            <w:r/>
             <w:r>
-              <w:rPr>
-                <w:b w:val="0"/>
-                <w:sz w:val="17"/>
-              </w:rPr>
-              <w:t>Creación manual de visitas y actualización de su estado.</w:t>
+              <w:t>Creación y edición manual con o sin operador; horario configurado, validación de conflictos, almacenamiento UTC y visualización en Chile. Cancelar conserva visita, croquis y trampas.</w:t>
             </w:r>
           </w:p>
         </w:tc>
       </w:tr>
       <w:tr>
+        <w:trPr/>
         <w:tc>
           <w:tcPr>
             <w:tcW w:type="dxa" w:w="2448"/>
@@ -438,14 +445,11 @@
           </w:tcPr>
           <w:p>
             <w:pPr>
+              <w:keepNext w:val="0"/>
+              <w:keepLines w:val="0"/>
               <w:spacing w:after="40" w:before="40"/>
             </w:pPr>
-            <w:r/>
             <w:r>
-              <w:rPr>
-                <w:b w:val="0"/>
-                <w:sz w:val="17"/>
-              </w:rPr>
               <w:t>Aplicación móvil</w:t>
             </w:r>
           </w:p>
@@ -466,20 +470,18 @@
           </w:tcPr>
           <w:p>
             <w:pPr>
+              <w:keepNext w:val="0"/>
+              <w:keepLines w:val="0"/>
               <w:spacing w:after="40" w:before="40"/>
             </w:pPr>
-            <w:r/>
             <w:r>
-              <w:rPr>
-                <w:b w:val="0"/>
-                <w:sz w:val="17"/>
-              </w:rPr>
-              <w:t>Agenda diaria, detalle de visita, croquis y registro de visita.</w:t>
+              <w:t>Código de agenda, detalle, croquis e historial disponible; API técnica probada. La validación del cliente en el teléfono no está registrada.</w:t>
             </w:r>
           </w:p>
         </w:tc>
       </w:tr>
       <w:tr>
+        <w:trPr/>
         <w:tc>
           <w:tcPr>
             <w:tcW w:type="dxa" w:w="2448"/>
@@ -495,14 +497,11 @@
           </w:tcPr>
           <w:p>
             <w:pPr>
+              <w:keepNext w:val="0"/>
+              <w:keepLines w:val="0"/>
               <w:spacing w:after="40" w:before="40"/>
             </w:pPr>
-            <w:r/>
             <w:r>
-              <w:rPr>
-                <w:b w:val="0"/>
-                <w:sz w:val="17"/>
-              </w:rPr>
               <w:t>Croquis</w:t>
             </w:r>
           </w:p>
@@ -522,20 +521,18 @@
           </w:tcPr>
           <w:p>
             <w:pPr>
+              <w:keepNext w:val="0"/>
+              <w:keepLines w:val="0"/>
               <w:spacing w:after="40" w:before="40"/>
             </w:pPr>
-            <w:r/>
             <w:r>
-              <w:rPr>
-                <w:b w:val="0"/>
-                <w:sz w:val="17"/>
-              </w:rPr>
-              <w:t>Visualización y ajuste de dispositivos con validación del operador.</w:t>
+              <w:t>Gestión de trampas en terreno y fotos disponibles en la app; panel de solo lectura con mapa real verificado en localhost:5173. Generación por IA, geocodificación y planos interiores automáticos no entregados.</w:t>
             </w:r>
           </w:p>
         </w:tc>
       </w:tr>
       <w:tr>
+        <w:trPr/>
         <w:tc>
           <w:tcPr>
             <w:tcW w:type="dxa" w:w="2448"/>
@@ -552,14 +549,64 @@
           </w:tcPr>
           <w:p>
             <w:pPr>
+              <w:keepNext w:val="0"/>
+              <w:keepLines w:val="0"/>
               <w:spacing w:after="40" w:before="40"/>
             </w:pPr>
-            <w:r/>
             <w:r>
-              <w:rPr>
-                <w:b w:val="0"/>
-                <w:sz w:val="17"/>
-              </w:rPr>
+              <w:t>WhatsApp</w:t>
+            </w:r>
+          </w:p>
+        </w:tc>
+        <w:tc>
+          <w:tcPr>
+            <w:tcW w:type="dxa" w:w="7488"/>
+            <w:vAlign w:val="center"/>
+            <w:tcBorders>
+              <w:top w:val="single" w:sz="4" w:color="D9E2DD"/>
+              <w:left w:val="single" w:sz="4" w:color="D9E2DD"/>
+              <w:bottom w:val="single" w:sz="4" w:color="D9E2DD"/>
+              <w:right w:val="single" w:sz="4" w:color="D9E2DD"/>
+              <w:insideH w:val="single" w:sz="4" w:color="D9E2DD"/>
+              <w:insideV w:val="single" w:sz="4" w:color="D9E2DD"/>
+            </w:tcBorders>
+            <w:shd w:fill="F1F5F2"/>
+          </w:tcPr>
+          <w:p>
+            <w:pPr>
+              <w:keepNext w:val="0"/>
+              <w:keepLines w:val="0"/>
+              <w:spacing w:after="40" w:before="40"/>
+            </w:pPr>
+            <w:r>
+              <w:t>Webhook y agente incluidos en main. Rechazo sin firma probado; no existe reporte de conversación real de Sandbox en las evidencias revisadas.</w:t>
+            </w:r>
+          </w:p>
+        </w:tc>
+      </w:tr>
+      <w:tr>
+        <w:trPr/>
+        <w:tc>
+          <w:tcPr>
+            <w:tcW w:type="dxa" w:w="2448"/>
+            <w:vAlign w:val="center"/>
+            <w:tcBorders>
+              <w:top w:val="single" w:sz="4" w:color="D9E2DD"/>
+              <w:left w:val="single" w:sz="4" w:color="D9E2DD"/>
+              <w:bottom w:val="single" w:sz="4" w:color="D9E2DD"/>
+              <w:right w:val="single" w:sz="4" w:color="D9E2DD"/>
+              <w:insideH w:val="single" w:sz="4" w:color="D9E2DD"/>
+              <w:insideV w:val="single" w:sz="4" w:color="D9E2DD"/>
+            </w:tcBorders>
+            <w:shd w:fill="F1F5F2"/>
+          </w:tcPr>
+          <w:p>
+            <w:pPr>
+              <w:keepNext w:val="0"/>
+              <w:keepLines w:val="0"/>
+              <w:spacing w:after="40" w:before="40"/>
+            </w:pPr>
+            <w:r>
               <w:t>Persistencia</w:t>
             </w:r>
           </w:p>
@@ -580,15 +627,12 @@
           </w:tcPr>
           <w:p>
             <w:pPr>
+              <w:keepNext w:val="0"/>
+              <w:keepLines w:val="0"/>
               <w:spacing w:after="40" w:before="40"/>
             </w:pPr>
-            <w:r/>
             <w:r>
-              <w:rPr>
-                <w:b w:val="0"/>
-                <w:sz w:val="17"/>
-              </w:rPr>
-              <w:t>PostgreSQL/PostGIS con historial de visitas y dispositivos.</w:t>
+              <w:t>PostgreSQL/PostGIS; integración real del panel en base aislada. El modo offline móvil conserva solo un esqueleto SQLite.</w:t>
             </w:r>
           </w:p>
         </w:tc>
@@ -604,6 +648,9 @@
         <w:pStyle w:val="Heading1"/>
       </w:pPr>
       <w:r>
+        <w:rPr>
+          <w:color w:val="000000"/>
+        </w:rPr>
         <w:t>3 Fuera del MVP</w:t>
       </w:r>
     </w:p>
@@ -657,6 +704,9 @@
         <w:pStyle w:val="Heading1"/>
       </w:pPr>
       <w:r>
+        <w:rPr>
+          <w:color w:val="000000"/>
+        </w:rPr>
         <w:t>4 Restricciones y supuestos</w:t>
       </w:r>
     </w:p>
@@ -665,12 +715,23 @@
         <w:tblStyle w:val="TableGrid"/>
         <w:tblW w:type="auto" w:w="0"/>
         <w:tblLook w:firstColumn="1" w:firstRow="1" w:lastColumn="0" w:lastRow="0" w:noHBand="0" w:noVBand="1" w:val="04A0"/>
+        <w:tblBorders>
+          <w:top w:val="single" w:sz="4" w:color="D9D9D9"/>
+          <w:left w:val="single" w:sz="4" w:color="D9D9D9"/>
+          <w:bottom w:val="single" w:sz="4" w:color="D9D9D9"/>
+          <w:right w:val="single" w:sz="4" w:color="D9D9D9"/>
+          <w:insideH w:val="single" w:sz="4" w:color="D9D9D9"/>
+          <w:insideV w:val="single" w:sz="4" w:color="D9D9D9"/>
+        </w:tblBorders>
       </w:tblPr>
       <w:tblGrid>
         <w:gridCol w:w="5040"/>
         <w:gridCol w:w="5040"/>
       </w:tblGrid>
       <w:tr>
+        <w:trPr>
+          <w:tblHeader/>
+        </w:trPr>
         <w:tc>
           <w:tcPr>
             <w:tcW w:type="dxa" w:w="1728"/>
@@ -687,6 +748,8 @@
           </w:tcPr>
           <w:p>
             <w:pPr>
+              <w:keepNext w:val="0"/>
+              <w:keepLines w:val="0"/>
               <w:spacing w:after="40" w:before="40"/>
             </w:pPr>
             <w:r/>
@@ -716,6 +779,8 @@
           </w:tcPr>
           <w:p>
             <w:pPr>
+              <w:keepNext w:val="0"/>
+              <w:keepLines w:val="0"/>
               <w:spacing w:after="40" w:before="40"/>
             </w:pPr>
             <w:r/>
@@ -731,6 +796,7 @@
         </w:tc>
       </w:tr>
       <w:tr>
+        <w:trPr/>
         <w:tc>
           <w:tcPr>
             <w:tcW w:type="dxa" w:w="1728"/>
@@ -746,6 +812,8 @@
           </w:tcPr>
           <w:p>
             <w:pPr>
+              <w:keepNext w:val="0"/>
+              <w:keepLines w:val="0"/>
               <w:spacing w:after="40" w:before="40"/>
             </w:pPr>
             <w:r/>
@@ -773,20 +841,18 @@
           </w:tcPr>
           <w:p>
             <w:pPr>
+              <w:keepNext w:val="0"/>
+              <w:keepLines w:val="0"/>
               <w:spacing w:after="40" w:before="40"/>
             </w:pPr>
-            <w:r/>
             <w:r>
-              <w:rPr>
-                <w:b w:val="0"/>
-                <w:sz w:val="17"/>
-              </w:rPr>
-              <w:t>La Fase 2 se ejecuta en 11 semanas, con sprints semanales.</w:t>
+              <w:t>Plan original de 11 sprints semanales; la numeración no acredita fechas ni ejecución de reuniones.</w:t>
             </w:r>
           </w:p>
         </w:tc>
       </w:tr>
       <w:tr>
+        <w:trPr/>
         <w:tc>
           <w:tcPr>
             <w:tcW w:type="dxa" w:w="1728"/>
@@ -803,6 +869,8 @@
           </w:tcPr>
           <w:p>
             <w:pPr>
+              <w:keepNext w:val="0"/>
+              <w:keepLines w:val="0"/>
               <w:spacing w:after="40" w:before="40"/>
             </w:pPr>
             <w:r/>
@@ -831,6 +899,8 @@
           </w:tcPr>
           <w:p>
             <w:pPr>
+              <w:keepNext w:val="0"/>
+              <w:keepLines w:val="0"/>
               <w:spacing w:after="40" w:before="40"/>
             </w:pPr>
             <w:r/>
@@ -845,6 +915,7 @@
         </w:tc>
       </w:tr>
       <w:tr>
+        <w:trPr/>
         <w:tc>
           <w:tcPr>
             <w:tcW w:type="dxa" w:w="1728"/>
@@ -860,6 +931,8 @@
           </w:tcPr>
           <w:p>
             <w:pPr>
+              <w:keepNext w:val="0"/>
+              <w:keepLines w:val="0"/>
               <w:spacing w:after="40" w:before="40"/>
             </w:pPr>
             <w:r/>
@@ -887,6 +960,8 @@
           </w:tcPr>
           <w:p>
             <w:pPr>
+              <w:keepNext w:val="0"/>
+              <w:keepLines w:val="0"/>
               <w:spacing w:after="40" w:before="40"/>
             </w:pPr>
             <w:r/>
@@ -901,6 +976,7 @@
         </w:tc>
       </w:tr>
       <w:tr>
+        <w:trPr/>
         <w:tc>
           <w:tcPr>
             <w:tcW w:type="dxa" w:w="1728"/>
@@ -917,6 +993,8 @@
           </w:tcPr>
           <w:p>
             <w:pPr>
+              <w:keepNext w:val="0"/>
+              <w:keepLines w:val="0"/>
               <w:spacing w:after="40" w:before="40"/>
             </w:pPr>
             <w:r/>
@@ -945,20 +1023,24 @@
           </w:tcPr>
           <w:p>
             <w:pPr>
+              <w:keepNext w:val="0"/>
+              <w:keepLines w:val="0"/>
               <w:spacing w:after="40" w:before="40"/>
             </w:pPr>
-            <w:r/>
+            <w:r>
+              <w:t>JWT y roles, CORS restringido y permisos por empresa en visitas, croquis y fotos. Los 30 casos de aislamiento de E4 aprobaron tras integrar el PR #14.</w:t>
+            </w:r>
             <w:r>
               <w:rPr>
                 <w:b w:val="0"/>
                 <w:sz w:val="17"/>
               </w:rPr>
-              <w:t>Autenticación, roles, CORS restringido y mínima exposición de datos en móvil.</w:t>
             </w:r>
           </w:p>
         </w:tc>
       </w:tr>
       <w:tr>
+        <w:trPr/>
         <w:tc>
           <w:tcPr>
             <w:tcW w:type="dxa" w:w="1728"/>
@@ -974,6 +1056,8 @@
           </w:tcPr>
           <w:p>
             <w:pPr>
+              <w:keepNext w:val="0"/>
+              <w:keepLines w:val="0"/>
               <w:spacing w:after="40" w:before="40"/>
             </w:pPr>
             <w:r/>
@@ -1001,6 +1085,8 @@
           </w:tcPr>
           <w:p>
             <w:pPr>
+              <w:keepNext w:val="0"/>
+              <w:keepLines w:val="0"/>
               <w:spacing w:after="40" w:before="40"/>
             </w:pPr>
             <w:r/>
@@ -1025,6 +1111,9 @@
         <w:pStyle w:val="Heading1"/>
       </w:pPr>
       <w:r>
+        <w:rPr>
+          <w:color w:val="000000"/>
+        </w:rPr>
         <w:t>5 Criterios de éxito</w:t>
       </w:r>
     </w:p>
@@ -1043,7 +1132,7 @@
         <w:spacing w:after="60"/>
       </w:pPr>
       <w:r>
-        <w:t>Se puede crear una visita para un cliente y operador sin perder la trazabilidad.</w:t>
+        <w:t>Se puede crear una visita con cliente y un operador válido, o sin asignar; la API conserva operador_id como null cuando corresponde.</w:t>
       </w:r>
     </w:p>
     <w:p>
@@ -1078,6 +1167,9 @@
         <w:pStyle w:val="Heading1"/>
       </w:pPr>
       <w:r>
+        <w:rPr>
+          <w:color w:val="000000"/>
+        </w:rPr>
         <w:t>6 Roles y responsabilidades</w:t>
       </w:r>
     </w:p>
@@ -1086,12 +1178,23 @@
         <w:tblStyle w:val="TableGrid"/>
         <w:tblW w:type="auto" w:w="0"/>
         <w:tblLook w:firstColumn="1" w:firstRow="1" w:lastColumn="0" w:lastRow="0" w:noHBand="0" w:noVBand="1" w:val="04A0"/>
+        <w:tblBorders>
+          <w:top w:val="single" w:sz="4" w:color="D9D9D9"/>
+          <w:left w:val="single" w:sz="4" w:color="D9D9D9"/>
+          <w:bottom w:val="single" w:sz="4" w:color="D9D9D9"/>
+          <w:right w:val="single" w:sz="4" w:color="D9D9D9"/>
+          <w:insideH w:val="single" w:sz="4" w:color="D9D9D9"/>
+          <w:insideV w:val="single" w:sz="4" w:color="D9D9D9"/>
+        </w:tblBorders>
       </w:tblPr>
       <w:tblGrid>
         <w:gridCol w:w="5040"/>
         <w:gridCol w:w="5040"/>
       </w:tblGrid>
       <w:tr>
+        <w:trPr>
+          <w:tblHeader/>
+        </w:trPr>
         <w:tc>
           <w:tcPr>
             <w:tcW w:type="dxa" w:w="2304"/>
@@ -1108,6 +1211,8 @@
           </w:tcPr>
           <w:p>
             <w:pPr>
+              <w:keepNext w:val="0"/>
+              <w:keepLines w:val="0"/>
               <w:spacing w:after="40" w:before="40"/>
             </w:pPr>
             <w:r/>
@@ -1137,6 +1242,8 @@
           </w:tcPr>
           <w:p>
             <w:pPr>
+              <w:keepNext w:val="0"/>
+              <w:keepLines w:val="0"/>
               <w:spacing w:after="40" w:before="40"/>
             </w:pPr>
             <w:r/>
@@ -1152,6 +1259,7 @@
         </w:tc>
       </w:tr>
       <w:tr>
+        <w:trPr/>
         <w:tc>
           <w:tcPr>
             <w:tcW w:type="dxa" w:w="2304"/>
@@ -1167,14 +1275,11 @@
           </w:tcPr>
           <w:p>
             <w:pPr>
+              <w:keepNext w:val="0"/>
+              <w:keepLines w:val="0"/>
               <w:spacing w:after="40" w:before="40"/>
             </w:pPr>
-            <w:r/>
             <w:r>
-              <w:rPr>
-                <w:b w:val="0"/>
-                <w:sz w:val="17"/>
-              </w:rPr>
               <w:t>Juan Bórquez</w:t>
             </w:r>
           </w:p>
@@ -1194,20 +1299,18 @@
           </w:tcPr>
           <w:p>
             <w:pPr>
+              <w:keepNext w:val="0"/>
+              <w:keepLines w:val="0"/>
               <w:spacing w:after="40" w:before="40"/>
             </w:pPr>
-            <w:r/>
             <w:r>
-              <w:rPr>
-                <w:b w:val="0"/>
-                <w:sz w:val="17"/>
-              </w:rPr>
-              <w:t>Panel web, agendamiento y coordinación de requisitos.</w:t>
+              <w:t>Panel, agendamiento, documentación de pruebas.</w:t>
             </w:r>
           </w:p>
         </w:tc>
       </w:tr>
       <w:tr>
+        <w:trPr/>
         <w:tc>
           <w:tcPr>
             <w:tcW w:type="dxa" w:w="2304"/>
@@ -1224,6 +1327,8 @@
           </w:tcPr>
           <w:p>
             <w:pPr>
+              <w:keepNext w:val="0"/>
+              <w:keepLines w:val="0"/>
               <w:spacing w:after="40" w:before="40"/>
             </w:pPr>
             <w:r/>
@@ -1252,6 +1357,8 @@
           </w:tcPr>
           <w:p>
             <w:pPr>
+              <w:keepNext w:val="0"/>
+              <w:keepLines w:val="0"/>
               <w:spacing w:after="40" w:before="40"/>
             </w:pPr>
             <w:r/>
@@ -1266,6 +1373,7 @@
         </w:tc>
       </w:tr>
       <w:tr>
+        <w:trPr/>
         <w:tc>
           <w:tcPr>
             <w:tcW w:type="dxa" w:w="2304"/>
@@ -1281,6 +1389,8 @@
           </w:tcPr>
           <w:p>
             <w:pPr>
+              <w:keepNext w:val="0"/>
+              <w:keepLines w:val="0"/>
               <w:spacing w:after="40" w:before="40"/>
             </w:pPr>
             <w:r/>
@@ -1308,6 +1418,8 @@
           </w:tcPr>
           <w:p>
             <w:pPr>
+              <w:keepNext w:val="0"/>
+              <w:keepLines w:val="0"/>
               <w:spacing w:after="40" w:before="40"/>
             </w:pPr>
             <w:r/>
@@ -1322,6 +1434,7 @@
         </w:tc>
       </w:tr>
       <w:tr>
+        <w:trPr/>
         <w:tc>
           <w:tcPr>
             <w:tcW w:type="dxa" w:w="2304"/>
@@ -1338,6 +1451,8 @@
           </w:tcPr>
           <w:p>
             <w:pPr>
+              <w:keepNext w:val="0"/>
+              <w:keepLines w:val="0"/>
               <w:spacing w:after="40" w:before="40"/>
             </w:pPr>
             <w:r/>
@@ -1366,6 +1481,8 @@
           </w:tcPr>
           <w:p>
             <w:pPr>
+              <w:keepNext w:val="0"/>
+              <w:keepLines w:val="0"/>
               <w:spacing w:after="40" w:before="40"/>
             </w:pPr>
             <w:r/>
@@ -1384,6 +1501,27 @@
       <w:pPr>
         <w:spacing w:after="20"/>
       </w:pPr>
+    </w:p>
+    <w:p>
+      <w:pPr>
+        <w:pStyle w:val="Heading1"/>
+      </w:pPr>
+      <w:r>
+        <w:rPr>
+          <w:color w:val="000000"/>
+        </w:rPr>
+        <w:t>7 Evidencias y aceptación</w:t>
+      </w:r>
+    </w:p>
+    <w:p>
+      <w:r>
+        <w:t>El corte técnico del 20/10/2026 registra 205 pruebas aprobadas: 107 backend y 98 frontend, sin fallas ni omisiones. Las 30 de aislamiento están incluidas en las 107, no se suman otra vez. Se verificó además el mapa real con datos sintéticos. E4: Verificacion_PR14_2026-10-20.md; E5: Croquis_maps_real_2026-10-20.md, en la carpeta pruebas. Se conservan las ejecuciones del 6 y 9 de octubre como historial; ninguna sustituye la aceptación del cliente.</w:t>
+      </w:r>
+    </w:p>
+    <w:p>
+      <w:r>
+        <w:t>Rodrigo Quiroga fue identificado por Juan como representante para la validación. Su cargo, la fecha de la sesión, los resultados y la firma deben registrarse en el acta de validación.</w:t>
+      </w:r>
     </w:p>
     <w:sectPr>
       <w:footerReference w:type="default" r:id="rId9"/>
@@ -2172,7 +2310,7 @@
       <w:rFonts w:asciiTheme="majorHAnsi" w:eastAsiaTheme="majorEastAsia" w:hAnsiTheme="majorHAnsi" w:cstheme="majorBidi"/>
       <w:i/>
       <w:iCs/>
-      <w:color w:val="4F81BD" w:themeColor="accent1"/>
+      <w:color w:val="000000"/>
       <w:spacing w:val="15"/>
       <w:sz w:val="24"/>
       <w:szCs w:val="24"/>

</xml_diff>